<commit_message>
Update Round 2 Guess The Lyrics clues and fix expand lightbox navigation to stay in expand mode
</commit_message>
<xml_diff>
--- a/Round 2/Guess The Lyrics.docx
+++ b/Round 2/Guess The Lyrics.docx
@@ -382,6 +382,7 @@
           <w:szCs w:val="144"/>
         </w:rPr>
       </w:pPr>
+      <w:proofErr w:type="gramStart"/>
       <w:r>
         <w:rPr>
           <w:rFonts w:ascii="Segoe UI Emoji" w:hAnsi="Segoe UI Emoji" w:cs="Segoe UI Emoji"/>
@@ -389,8 +390,17 @@
           <w:szCs w:val="144"/>
         </w:rPr>
         <w:lastRenderedPageBreak/>
+        <w:t>Role:</w:t>
+      </w:r>
+      <w:r>
+        <w:rPr>
+          <w:rFonts w:ascii="Segoe UI Emoji" w:hAnsi="Segoe UI Emoji" w:cs="Segoe UI Emoji"/>
+          <w:sz w:val="96"/>
+          <w:szCs w:val="144"/>
+        </w:rPr>
         <w:t>👨</w:t>
       </w:r>
+      <w:proofErr w:type="gramEnd"/>
       <w:r>
         <w:rPr>
           <w:sz w:val="96"/>
@@ -412,7 +422,14 @@
           <w:sz w:val="96"/>
           <w:szCs w:val="144"/>
         </w:rPr>
-        <w:t xml:space="preserve"> Pradeep Ranganathan</w:t>
+        <w:t xml:space="preserve"> </w:t>
+      </w:r>
+      <w:r>
+        <w:rPr>
+          <w:sz w:val="96"/>
+          <w:szCs w:val="144"/>
+        </w:rPr>
+        <w:t>Agan</w:t>
       </w:r>
     </w:p>
     <w:p>
@@ -460,21 +477,12 @@
         </w:rPr>
         <w:t xml:space="preserve"> </w:t>
       </w:r>
-      <w:proofErr w:type="spellStart"/>
-      <w:r>
-        <w:rPr>
-          <w:sz w:val="96"/>
-          <w:szCs w:val="144"/>
-        </w:rPr>
-        <w:t>Mamitha</w:t>
-      </w:r>
-      <w:proofErr w:type="spellEnd"/>
-      <w:r>
-        <w:rPr>
-          <w:sz w:val="96"/>
-          <w:szCs w:val="144"/>
-        </w:rPr>
-        <w:t xml:space="preserve"> Baiju</w:t>
+      <w:r>
+        <w:rPr>
+          <w:sz w:val="96"/>
+          <w:szCs w:val="144"/>
+        </w:rPr>
+        <w:t>Kural</w:t>
       </w:r>
     </w:p>
     <w:p>
@@ -854,7 +862,14 @@
           <w:sz w:val="96"/>
           <w:szCs w:val="144"/>
         </w:rPr>
-        <w:t xml:space="preserve"> Folk / Celebration</w:t>
+        <w:t xml:space="preserve"> </w:t>
+      </w:r>
+      <w:r>
+        <w:rPr>
+          <w:sz w:val="96"/>
+          <w:szCs w:val="144"/>
+        </w:rPr>
+        <w:t>Love &amp; Melody</w:t>
       </w:r>
     </w:p>
     <w:p>
@@ -934,65 +949,82 @@
           <w:sz w:val="96"/>
           <w:szCs w:val="144"/>
         </w:rPr>
-        <w:t xml:space="preserve"> Santhosh Narayanan</w:t>
-      </w:r>
-    </w:p>
-    <w:p>
-      <w:pPr>
-        <w:rPr>
-          <w:sz w:val="96"/>
-          <w:szCs w:val="144"/>
-        </w:rPr>
-      </w:pPr>
-    </w:p>
-    <w:p>
-      <w:pPr>
-        <w:rPr>
-          <w:sz w:val="96"/>
-          <w:szCs w:val="144"/>
-        </w:rPr>
-      </w:pPr>
-    </w:p>
-    <w:p>
-      <w:pPr>
-        <w:rPr>
-          <w:sz w:val="96"/>
-          <w:szCs w:val="144"/>
-        </w:rPr>
-      </w:pPr>
-    </w:p>
-    <w:p>
-      <w:pPr>
-        <w:rPr>
-          <w:sz w:val="96"/>
-          <w:szCs w:val="144"/>
-        </w:rPr>
-      </w:pPr>
-    </w:p>
-    <w:p>
-      <w:pPr>
-        <w:rPr>
-          <w:sz w:val="96"/>
-          <w:szCs w:val="144"/>
-        </w:rPr>
-      </w:pPr>
-    </w:p>
-    <w:p>
-      <w:pPr>
-        <w:rPr>
-          <w:sz w:val="96"/>
-          <w:szCs w:val="144"/>
-        </w:rPr>
-      </w:pPr>
-    </w:p>
-    <w:p>
-      <w:pPr>
-        <w:rPr>
-          <w:sz w:val="96"/>
-          <w:szCs w:val="144"/>
-          <w:lang w:val="en-US"/>
-        </w:rPr>
-      </w:pPr>
+        <w:t xml:space="preserve"> </w:t>
+      </w:r>
+      <w:r>
+        <w:rPr>
+          <w:sz w:val="96"/>
+          <w:szCs w:val="144"/>
+        </w:rPr>
+        <w:t xml:space="preserve">Harris </w:t>
+      </w:r>
+      <w:proofErr w:type="spellStart"/>
+      <w:r>
+        <w:rPr>
+          <w:sz w:val="96"/>
+          <w:szCs w:val="144"/>
+        </w:rPr>
+        <w:t>jayaraj</w:t>
+      </w:r>
+      <w:proofErr w:type="spellEnd"/>
+    </w:p>
+    <w:p>
+      <w:pPr>
+        <w:rPr>
+          <w:sz w:val="96"/>
+          <w:szCs w:val="144"/>
+        </w:rPr>
+      </w:pPr>
+    </w:p>
+    <w:p>
+      <w:pPr>
+        <w:rPr>
+          <w:sz w:val="96"/>
+          <w:szCs w:val="144"/>
+        </w:rPr>
+      </w:pPr>
+    </w:p>
+    <w:p>
+      <w:pPr>
+        <w:rPr>
+          <w:sz w:val="96"/>
+          <w:szCs w:val="144"/>
+        </w:rPr>
+      </w:pPr>
+    </w:p>
+    <w:p>
+      <w:pPr>
+        <w:rPr>
+          <w:sz w:val="96"/>
+          <w:szCs w:val="144"/>
+        </w:rPr>
+      </w:pPr>
+    </w:p>
+    <w:p>
+      <w:pPr>
+        <w:rPr>
+          <w:sz w:val="96"/>
+          <w:szCs w:val="144"/>
+        </w:rPr>
+      </w:pPr>
+    </w:p>
+    <w:p>
+      <w:pPr>
+        <w:rPr>
+          <w:sz w:val="96"/>
+          <w:szCs w:val="144"/>
+        </w:rPr>
+      </w:pPr>
+    </w:p>
+    <w:p>
+      <w:pPr>
+        <w:rPr>
+          <w:sz w:val="96"/>
+          <w:szCs w:val="144"/>
+          <w:lang w:val="en-US"/>
+        </w:rPr>
+      </w:pPr>
+      <w:proofErr w:type="gramStart"/>
       <w:r>
         <w:rPr>
           <w:rFonts w:ascii="Segoe UI Emoji" w:hAnsi="Segoe UI Emoji" w:cs="Segoe UI Emoji"/>
@@ -1000,8 +1032,17 @@
           <w:szCs w:val="144"/>
         </w:rPr>
         <w:lastRenderedPageBreak/>
+        <w:t>Role:</w:t>
+      </w:r>
+      <w:r>
+        <w:rPr>
+          <w:rFonts w:ascii="Segoe UI Emoji" w:hAnsi="Segoe UI Emoji" w:cs="Segoe UI Emoji"/>
+          <w:sz w:val="96"/>
+          <w:szCs w:val="144"/>
+        </w:rPr>
         <w:t>🎭</w:t>
       </w:r>
+      <w:proofErr w:type="gramEnd"/>
       <w:r>
         <w:rPr>
           <w:sz w:val="96"/>
@@ -1023,7 +1064,14 @@
           <w:sz w:val="96"/>
           <w:szCs w:val="144"/>
         </w:rPr>
-        <w:t xml:space="preserve"> Suriya &amp; Pooja Hegde</w:t>
+        <w:t xml:space="preserve"> Suriya &amp; </w:t>
+      </w:r>
+      <w:r>
+        <w:rPr>
+          <w:sz w:val="96"/>
+          <w:szCs w:val="144"/>
+        </w:rPr>
+        <w:t>Priya</w:t>
       </w:r>
       <w:r>
         <w:rPr>
@@ -1552,6 +1600,14 @@
         <w:lastRenderedPageBreak/>
         <w:t xml:space="preserve">  </w:t>
       </w:r>
+      <w:proofErr w:type="gramStart"/>
+      <w:r>
+        <w:rPr>
+          <w:sz w:val="96"/>
+          <w:szCs w:val="144"/>
+        </w:rPr>
+        <w:t>Role:</w:t>
+      </w:r>
       <w:r>
         <w:rPr>
           <w:rFonts w:ascii="Segoe UI Emoji" w:hAnsi="Segoe UI Emoji" w:cs="Segoe UI Emoji"/>
@@ -1560,6 +1616,7 @@
         </w:rPr>
         <w:t>👩</w:t>
       </w:r>
+      <w:proofErr w:type="gramEnd"/>
       <w:r>
         <w:rPr>
           <w:sz w:val="96"/>
@@ -1595,7 +1652,28 @@
           <w:sz w:val="96"/>
           <w:szCs w:val="144"/>
         </w:rPr>
-        <w:t xml:space="preserve"> Hero &amp; Heroine: Vijay &amp; Shriya Saran</w:t>
+        <w:t xml:space="preserve"> Hero &amp; Heroine: </w:t>
+      </w:r>
+      <w:r>
+        <w:rPr>
+          <w:sz w:val="96"/>
+          <w:szCs w:val="144"/>
+        </w:rPr>
+        <w:t>Guru</w:t>
+      </w:r>
+      <w:r>
+        <w:rPr>
+          <w:sz w:val="96"/>
+          <w:szCs w:val="144"/>
+        </w:rPr>
+        <w:t xml:space="preserve"> &amp; </w:t>
+      </w:r>
+      <w:r>
+        <w:rPr>
+          <w:sz w:val="96"/>
+          <w:szCs w:val="144"/>
+        </w:rPr>
+        <w:t>Abinaya</w:t>
       </w:r>
     </w:p>
     <w:p>
@@ -2225,6 +2303,14 @@
         <w:rPr>
           <w:sz w:val="96"/>
           <w:szCs w:val="144"/>
+        </w:rPr>
+      </w:pPr>
+    </w:p>
+    <w:p>
+      <w:pPr>
+        <w:rPr>
+          <w:sz w:val="96"/>
+          <w:szCs w:val="144"/>
           <w:lang w:val="en-US"/>
         </w:rPr>
       </w:pPr>
@@ -2236,6 +2322,15 @@
         <w:lastRenderedPageBreak/>
         <w:t xml:space="preserve">  </w:t>
       </w:r>
+      <w:proofErr w:type="gramStart"/>
+      <w:r>
+        <w:rPr>
+          <w:sz w:val="96"/>
+          <w:szCs w:val="144"/>
+        </w:rPr>
+        <w:t>Role :</w:t>
+      </w:r>
+      <w:proofErr w:type="gramEnd"/>
       <w:r>
         <w:rPr>
           <w:rFonts w:ascii="Segoe UI Emoji" w:hAnsi="Segoe UI Emoji" w:cs="Segoe UI Emoji"/>
@@ -2265,7 +2360,14 @@
           <w:sz w:val="96"/>
           <w:szCs w:val="144"/>
         </w:rPr>
-        <w:t xml:space="preserve"> Suriya &amp; Pooja Hegde</w:t>
+        <w:t xml:space="preserve"> </w:t>
+      </w:r>
+      <w:r>
+        <w:rPr>
+          <w:sz w:val="96"/>
+          <w:szCs w:val="144"/>
+        </w:rPr>
+        <w:t>Paari &amp; Rukmani</w:t>
       </w:r>
     </w:p>
     <w:p>
@@ -2870,7 +2972,21 @@
           <w:sz w:val="96"/>
           <w:szCs w:val="144"/>
         </w:rPr>
-        <w:t xml:space="preserve"> Romantic Melody</w:t>
+        <w:t xml:space="preserve"> Romantic </w:t>
+      </w:r>
+      <w:r>
+        <w:rPr>
+          <w:sz w:val="96"/>
+          <w:szCs w:val="144"/>
+        </w:rPr>
+        <w:t xml:space="preserve">&amp; </w:t>
+      </w:r>
+      <w:r>
+        <w:rPr>
+          <w:sz w:val="96"/>
+          <w:szCs w:val="144"/>
+        </w:rPr>
+        <w:t>Melody</w:t>
       </w:r>
     </w:p>
     <w:p>
@@ -3021,6 +3137,14 @@
         <w:rPr>
           <w:sz w:val="96"/>
           <w:szCs w:val="144"/>
+        </w:rPr>
+      </w:pPr>
+    </w:p>
+    <w:p>
+      <w:pPr>
+        <w:rPr>
+          <w:sz w:val="96"/>
+          <w:szCs w:val="144"/>
           <w:lang w:val="en-US"/>
         </w:rPr>
       </w:pPr>
@@ -3030,6 +3154,13 @@
           <w:szCs w:val="144"/>
         </w:rPr>
         <w:lastRenderedPageBreak/>
+        <w:t>Role:</w:t>
+      </w:r>
+      <w:r>
+        <w:rPr>
+          <w:sz w:val="96"/>
+          <w:szCs w:val="144"/>
+        </w:rPr>
         <w:t xml:space="preserve">  </w:t>
       </w:r>
       <w:r>
@@ -3061,7 +3192,14 @@
           <w:sz w:val="96"/>
           <w:szCs w:val="144"/>
         </w:rPr>
-        <w:t xml:space="preserve"> Karthi &amp; Tamannaah</w:t>
+        <w:t xml:space="preserve"> </w:t>
+      </w:r>
+      <w:r>
+        <w:rPr>
+          <w:sz w:val="96"/>
+          <w:szCs w:val="144"/>
+        </w:rPr>
+        <w:t>Siva &amp; Chaaru</w:t>
       </w:r>
     </w:p>
     <w:p>
@@ -4175,6 +4313,7 @@
   <w:style w:type="character" w:default="1" w:styleId="DefaultParagraphFont">
     <w:name w:val="Default Paragraph Font"/>
     <w:uiPriority w:val="1"/>
+    <w:semiHidden/>
     <w:unhideWhenUsed/>
   </w:style>
   <w:style w:type="table" w:default="1" w:styleId="TableNormal">

</xml_diff>